<commit_message>
feat(s5-t07): add safe text correction batch pipeline
</commit_message>
<xml_diff>
--- a/backend/tests/fixtures/docx/generated/exact-text-anchor.docx
+++ b/backend/tests/fixtures/docx/generated/exact-text-anchor.docx
@@ -49,7 +49,7 @@
       <w:r>
         <w:t>Tautan </w:t>
       </w:r>
-      <w:hyperlink xmlns:r="http://schemas.openxmlformats.org/officeDocument/2006/relationships" r:id="R05289e0ebf984080">
+      <w:hyperlink xmlns:r="http://schemas.openxmlformats.org/officeDocument/2006/relationships" r:id="Rf46c0dfab9a5401b">
         <w:r>
           <w:t>di analisa</w:t>
         </w:r>
@@ -130,6 +130,19 @@
         <w:t> akhir</w:t>
       </w:r>
     </w:p>
+    <w:p>
+      <w:r>
+        <w:t>Split aman di </w:t>
+      </w:r>
+      <w:r>
+        <w:t>analisa selesai.</w:t>
+      </w:r>
+    </w:p>
+    <w:p>
+      <w:r>
+        <w:t>aktifitas aktifitasx xaktifitas resiko resikoo</w:t>
+      </w:r>
+    </w:p>
     <w:sectPr>
       <w:pgSz w:w="11906" w:h="16838"/>
       <w:pgMar w:top="1701" w:right="1701" w:bottom="1701" w:left="2268" w:header="720" w:footer="720" w:gutter="0"/>

</xml_diff>